<commit_message>
Padroniza exemplos GPU e corrige render de regressao
</commit_message>
<xml_diff>
--- a/examples/autoencoder/doc/01_autoenc_e.docx
+++ b/examples/autoencoder/doc/01_autoenc_e.docx
@@ -1750,7 +1750,7 @@
               <a:graphicData uri="http://schemas.openxmlformats.org/drawingml/2006/picture">
                 <pic:pic>
                   <pic:nvPicPr>
-                    <pic:cNvPr descr="/home/gpca/daltoolboxdp/examples/autoencoder/doc/01_autoenc_e_files/3742345403e165f3706d947928bf5014e0d331b4.png" id="11" name="Picture"/>
+                    <pic:cNvPr descr="C:\Git\dal\daltoolboxdp\examples\autoencoder\doc\01_autoenc_e_files/c0009885c555a0af62095c0ad0de8df8c34491da.png" id="11" name="Picture"/>
                     <pic:cNvPicPr>
                       <a:picLocks noChangeArrowheads="1" noChangeAspect="1"/>
                     </pic:cNvPicPr>
@@ -1965,25 +1965,25 @@
         <w:rPr>
           <w:rStyle w:val="VerbatimChar"/>
         </w:rPr>
-        <w:t xml:space="preserve">## [1,] -0.8076045 -0.9357777 -1.0908371</w:t>
-      </w:r>
-      <w:r>
-        <w:br/>
-      </w:r>
-      <w:r>
-        <w:rPr>
-          <w:rStyle w:val="VerbatimChar"/>
-        </w:rPr>
-        <w:t xml:space="preserve">## [2,] -0.8834542 -1.0363986 -1.1289582</w:t>
-      </w:r>
-      <w:r>
-        <w:br/>
-      </w:r>
-      <w:r>
-        <w:rPr>
-          <w:rStyle w:val="VerbatimChar"/>
-        </w:rPr>
-        <w:t xml:space="preserve">## [3,] -0.9292879 -1.0998564 -1.1295601</w:t>
+        <w:t xml:space="preserve">## [1,] -0.8076045 -0.9357776 -1.0908371</w:t>
+      </w:r>
+      <w:r>
+        <w:br/>
+      </w:r>
+      <w:r>
+        <w:rPr>
+          <w:rStyle w:val="VerbatimChar"/>
+        </w:rPr>
+        <w:t xml:space="preserve">## [2,] -0.8834543 -1.0363986 -1.1289583</w:t>
+      </w:r>
+      <w:r>
+        <w:br/>
+      </w:r>
+      <w:r>
+        <w:rPr>
+          <w:rStyle w:val="VerbatimChar"/>
+        </w:rPr>
+        <w:t xml:space="preserve">## [3,] -0.9292879 -1.0998565 -1.1295601</w:t>
       </w:r>
       <w:r>
         <w:br/>
@@ -2001,16 +2001,16 @@
         <w:rPr>
           <w:rStyle w:val="VerbatimChar"/>
         </w:rPr>
-        <w:t xml:space="preserve">## [5,] -0.9279286 -1.1109335 -1.0202658</w:t>
-      </w:r>
-      <w:r>
-        <w:br/>
-      </w:r>
-      <w:r>
-        <w:rPr>
-          <w:rStyle w:val="VerbatimChar"/>
-        </w:rPr>
-        <w:t xml:space="preserve">## [6,] -0.8858334 -1.0626917 -0.9198178</w:t>
+        <w:t xml:space="preserve">## [5,] -0.9279286 -1.1109335 -1.0202659</w:t>
+      </w:r>
+      <w:r>
+        <w:br/>
+      </w:r>
+      <w:r>
+        <w:rPr>
+          <w:rStyle w:val="VerbatimChar"/>
+        </w:rPr>
+        <w:t xml:space="preserve">## [6,] -0.8858335 -1.0626916 -0.9198179</w:t>
       </w:r>
     </w:p>
     <w:p>

</xml_diff>